<commit_message>
Implement exact 96 DPI pixel-perfect resolution formula, OpenXML Mm/Emu math, and synchronized CSS variables
</commit_message>
<xml_diff>
--- a/Trescon_Executive_Letterhead_Bangalore.docx
+++ b/Trescon_Executive_Letterhead_Bangalore.docx
@@ -119,8 +119,8 @@
     <w:sectPr>
       <w:headerReference w:type="default" r:id="rId9"/>
       <w:footerReference w:type="default" r:id="rId10"/>
-      <w:pgSz w:w="11909" w:h="16834"/>
-      <w:pgMar w:top="1584" w:right="576" w:bottom="1296" w:left="576" w:header="432" w:footer="432" w:gutter="0"/>
+      <w:pgSz w:w="11906" w:h="16838"/>
+      <w:pgMar w:top="1587" w:right="567" w:bottom="1134" w:left="567" w:header="397" w:footer="397" w:gutter="0"/>
       <w:cols w:space="720"/>
       <w:docGrid w:linePitch="360"/>
     </w:sectPr>
@@ -150,12 +150,12 @@
       </w:tblBorders>
     </w:tblPr>
     <w:tblGrid>
-      <w:gridCol w:w="10757"/>
+      <w:gridCol w:w="10772"/>
     </w:tblGrid>
     <w:tr>
       <w:tc>
         <w:tcPr>
-          <w:tcW w:type="dxa" w:w="10757"/>
+          <w:tcW w:type="dxa" w:w="10772"/>
           <w:tcBorders>
             <w:top w:val="none"/>
             <w:left w:val="none"/>
@@ -245,25 +245,26 @@
     <w:tblPr>
       <w:tblW w:type="auto" w:w="0"/>
       <w:jc w:val="center"/>
+      <w:tblLayout w:type="fixed"/>
       <w:tblLook w:firstColumn="1" w:firstRow="1" w:lastColumn="0" w:lastRow="0" w:noHBand="0" w:noVBand="1" w:val="04A0"/>
       <w:tblBorders>
         <w:top w:val="none"/>
         <w:left w:val="none"/>
-        <w:bottom w:val="single" w:sz="12" w:space="0" w:color="00A5A3"/>
+        <w:bottom w:val="none"/>
         <w:right w:val="none"/>
         <w:insideH w:val="none"/>
         <w:insideV w:val="none"/>
       </w:tblBorders>
     </w:tblPr>
     <w:tblGrid>
-      <w:gridCol w:w="3586"/>
-      <w:gridCol w:w="3586"/>
-      <w:gridCol w:w="3586"/>
+      <w:gridCol w:w="3969"/>
+      <w:gridCol w:w="3402"/>
+      <w:gridCol w:w="3402"/>
     </w:tblGrid>
     <w:tr>
       <w:tc>
         <w:tcPr>
-          <w:tcW w:type="dxa" w:w="4032"/>
+          <w:tcW w:type="dxa" w:w="3969"/>
           <w:tcBorders>
             <w:top w:val="none"/>
             <w:left w:val="none"/>
@@ -273,13 +274,13 @@
         </w:tcPr>
         <w:p>
           <w:pPr>
-            <w:spacing w:after="40"/>
+            <w:spacing w:after="0"/>
             <w:jc w:val="left"/>
           </w:pPr>
           <w:r>
             <w:drawing>
               <wp:inline xmlns:a="http://schemas.openxmlformats.org/drawingml/2006/main" xmlns:pic="http://schemas.openxmlformats.org/drawingml/2006/picture">
-                <wp:extent cx="2240280" cy="1376149"/>
+                <wp:extent cx="930364" cy="571500"/>
                 <wp:docPr id="1" name="Picture 1"/>
                 <wp:cNvGraphicFramePr>
                   <a:graphicFrameLocks noChangeAspect="1"/>
@@ -300,7 +301,7 @@
                       <pic:spPr>
                         <a:xfrm>
                           <a:off x="0" y="0"/>
-                          <a:ext cx="2240280" cy="1376149"/>
+                          <a:ext cx="930364" cy="571500"/>
                         </a:xfrm>
                         <a:prstGeom prst="rect"/>
                       </pic:spPr>
@@ -314,7 +315,7 @@
       </w:tc>
       <w:tc>
         <w:tcPr>
-          <w:tcW w:type="dxa" w:w="3744"/>
+          <w:tcW w:type="dxa" w:w="3402"/>
           <w:tcBorders>
             <w:top w:val="none"/>
             <w:left w:val="none"/>
@@ -330,7 +331,7 @@
         </w:tcPr>
         <w:p>
           <w:pPr>
-            <w:spacing w:before="160" w:after="0"/>
+            <w:spacing w:before="120" w:after="0"/>
             <w:jc w:val="left"/>
           </w:pPr>
           <w:r>
@@ -348,7 +349,7 @@
       </w:tc>
       <w:tc>
         <w:tcPr>
-          <w:tcW w:type="dxa" w:w="2981"/>
+          <w:tcW w:type="dxa" w:w="3402"/>
           <w:tcBorders>
             <w:top w:val="none"/>
             <w:left w:val="none"/>
@@ -358,9 +359,17 @@
         </w:tcPr>
         <w:p>
           <w:pPr>
-            <w:spacing w:before="160" w:after="0"/>
+            <w:spacing w:before="120" w:after="0"/>
             <w:jc w:val="right"/>
           </w:pPr>
+          <w:r>
+            <w:rPr>
+              <w:rFonts w:ascii="Segoe UI Symbol" w:hAnsi="Segoe UI Symbol"/>
+              <w:color w:val="00A5A3"/>
+              <w:sz w:val="18"/>
+            </w:rPr>
+            <w:t xml:space="preserve">✉ </w:t>
+          </w:r>
           <w:r>
             <w:rPr>
               <w:rFonts w:ascii="Manrope" w:hAnsi="Manrope"/>
@@ -369,6 +378,14 @@
             </w:rPr>
             <w:t>info@tresconglobal.com</w:t>
             <w:br/>
+          </w:r>
+          <w:r>
+            <w:rPr>
+              <w:rFonts w:ascii="Segoe UI Symbol" w:hAnsi="Segoe UI Symbol"/>
+              <w:color w:val="00A5A3"/>
+              <w:sz w:val="18"/>
+            </w:rPr>
+            <w:t xml:space="preserve">🌐 </w:t>
           </w:r>
           <w:r>
             <w:rPr>
@@ -385,7 +402,10 @@
   </w:tbl>
   <w:p>
     <w:pPr>
-      <w:spacing w:before="120" w:after="0"/>
+      <w:spacing w:before="160" w:after="0"/>
+      <w:pBdr>
+        <w:bottom w:val="single" w:sz="12" w:space="1" w:color="00A5A3"/>
+      </w:pBdr>
     </w:pPr>
   </w:p>
 </w:hdr>

</xml_diff>

<commit_message>
Add top decorative accent bar to OpenXML header and 12pt body paragraph clearance
</commit_message>
<xml_diff>
--- a/Trescon_Executive_Letterhead_Bangalore.docx
+++ b/Trescon_Executive_Letterhead_Bangalore.docx
@@ -4,7 +4,7 @@
   <w:body>
     <w:p>
       <w:pPr>
-        <w:spacing w:after="280"/>
+        <w:spacing w:before="240" w:after="280"/>
       </w:pPr>
       <w:r>
         <w:rPr>
@@ -120,7 +120,7 @@
       <w:headerReference w:type="default" r:id="rId9"/>
       <w:footerReference w:type="default" r:id="rId10"/>
       <w:pgSz w:w="11906" w:h="16838"/>
-      <w:pgMar w:top="1587" w:right="567" w:bottom="1134" w:left="567" w:header="397" w:footer="397" w:gutter="0"/>
+      <w:pgMar w:top="1928" w:right="567" w:bottom="1134" w:left="567" w:header="227" w:footer="397" w:gutter="0"/>
       <w:cols w:space="720"/>
       <w:docGrid w:linePitch="360"/>
     </w:sectPr>
@@ -239,6 +239,10 @@
   <w:p>
     <w:pPr>
       <w:pStyle w:val="Header"/>
+      <w:spacing w:before="0" w:after="160"/>
+      <w:pBdr>
+        <w:bottom w:val="single" w:sz="36" w:space="0" w:color="01373D"/>
+      </w:pBdr>
     </w:pPr>
   </w:p>
   <w:tbl>

</xml_diff>

<commit_message>
Update logo to official OneDrive PNG Artboard 1 and remove tagline from header across Word exporter and web studio
</commit_message>
<xml_diff>
--- a/Trescon_Executive_Letterhead_Bangalore.docx
+++ b/Trescon_Executive_Letterhead_Bangalore.docx
@@ -261,14 +261,13 @@
       </w:tblBorders>
     </w:tblPr>
     <w:tblGrid>
-      <w:gridCol w:w="3969"/>
-      <w:gridCol w:w="3402"/>
+      <w:gridCol w:w="7370"/>
       <w:gridCol w:w="3402"/>
     </w:tblGrid>
     <w:tr>
       <w:tc>
         <w:tcPr>
-          <w:tcW w:type="dxa" w:w="3969"/>
+          <w:tcW w:type="dxa" w:w="7370"/>
           <w:tcBorders>
             <w:top w:val="none"/>
             <w:left w:val="none"/>
@@ -284,7 +283,7 @@
           <w:r>
             <w:drawing>
               <wp:inline xmlns:a="http://schemas.openxmlformats.org/drawingml/2006/main" xmlns:pic="http://schemas.openxmlformats.org/drawingml/2006/picture">
-                <wp:extent cx="930364" cy="571500"/>
+                <wp:extent cx="2509120" cy="571500"/>
                 <wp:docPr id="1" name="Picture 1"/>
                 <wp:cNvGraphicFramePr>
                   <a:graphicFrameLocks noChangeAspect="1"/>
@@ -305,7 +304,7 @@
                       <pic:spPr>
                         <a:xfrm>
                           <a:off x="0" y="0"/>
-                          <a:ext cx="930364" cy="571500"/>
+                          <a:ext cx="2509120" cy="571500"/>
                         </a:xfrm>
                         <a:prstGeom prst="rect"/>
                       </pic:spPr>
@@ -326,44 +325,10 @@
             <w:bottom w:val="none"/>
             <w:right w:val="none"/>
           </w:tcBorders>
-          <w:tcBorders>
-            <w:top w:val="none"/>
-            <w:left w:val="single" w:sz="8" w:space="0" w:color="00A5A3"/>
-            <w:bottom w:val="none"/>
-            <w:right w:val="none"/>
-          </w:tcBorders>
         </w:tcPr>
         <w:p>
           <w:pPr>
-            <w:spacing w:before="120" w:after="0"/>
-            <w:jc w:val="left"/>
-          </w:pPr>
-          <w:r>
-            <w:rPr>
-              <w:rFonts w:ascii="Manrope" w:hAnsi="Manrope"/>
-              <w:b/>
-              <w:color w:val="01373D"/>
-              <w:sz w:val="19"/>
-            </w:rPr>
-            <w:t xml:space="preserve">  Connecting Businesses</w:t>
-            <w:br/>
-            <w:t xml:space="preserve">  with Opportunities</w:t>
-          </w:r>
-        </w:p>
-      </w:tc>
-      <w:tc>
-        <w:tcPr>
-          <w:tcW w:type="dxa" w:w="3402"/>
-          <w:tcBorders>
-            <w:top w:val="none"/>
-            <w:left w:val="none"/>
-            <w:bottom w:val="none"/>
-            <w:right w:val="none"/>
-          </w:tcBorders>
-        </w:tcPr>
-        <w:p>
-          <w:pPr>
-            <w:spacing w:before="120" w:after="0"/>
+            <w:spacing w:before="160" w:after="0"/>
             <w:jc w:val="right"/>
           </w:pPr>
           <w:r>

</xml_diff>